<commit_message>
Amélioration de la mise en page
</commit_message>
<xml_diff>
--- a/Cours/6eme/SaintExupery/Chapitre_2_4/Documents/Chapitre 2 - Partie 4 - Division décimale (A trou).docx
+++ b/Cours/6eme/SaintExupery/Chapitre_2_4/Documents/Chapitre 2 - Partie 4 - Division décimale (A trou).docx
@@ -1068,6 +1068,9 @@
               <w:tc>
                 <w:tcPr>
                   <w:tcW w:w="436" w:type="dxa"/>
+                  <w:tcBorders>
+                    <w:right w:val="dashed" w:sz="4" w:space="0" w:color="00B050"/>
+                  </w:tcBorders>
                 </w:tcPr>
                 <w:p>
                   <w:pPr>
@@ -1081,6 +1084,10 @@
               <w:tc>
                 <w:tcPr>
                   <w:tcW w:w="356" w:type="dxa"/>
+                  <w:tcBorders>
+                    <w:left w:val="dashed" w:sz="4" w:space="0" w:color="00B050"/>
+                  </w:tcBorders>
+                  <w:shd w:val="clear" w:color="auto" w:fill="D6E3BC" w:themeFill="accent3" w:themeFillTint="66"/>
                 </w:tcPr>
                 <w:p>
                   <w:pPr>
@@ -1094,6 +1101,7 @@
               <w:tc>
                 <w:tcPr>
                   <w:tcW w:w="356" w:type="dxa"/>
+                  <w:shd w:val="clear" w:color="auto" w:fill="D6E3BC" w:themeFill="accent3" w:themeFillTint="66"/>
                 </w:tcPr>
                 <w:p>
                   <w:pPr>
@@ -1110,6 +1118,7 @@
                   <w:tcBorders>
                     <w:right w:val="single" w:sz="12" w:space="0" w:color="auto"/>
                   </w:tcBorders>
+                  <w:shd w:val="clear" w:color="auto" w:fill="D6E3BC" w:themeFill="accent3" w:themeFillTint="66"/>
                 </w:tcPr>
                 <w:p>
                   <w:pPr>
@@ -1195,6 +1204,9 @@
               <w:tc>
                 <w:tcPr>
                   <w:tcW w:w="436" w:type="dxa"/>
+                  <w:tcBorders>
+                    <w:right w:val="dashed" w:sz="4" w:space="0" w:color="00B050"/>
+                  </w:tcBorders>
                 </w:tcPr>
                 <w:p>
                   <w:pPr>
@@ -1205,6 +1217,10 @@
               <w:tc>
                 <w:tcPr>
                   <w:tcW w:w="356" w:type="dxa"/>
+                  <w:tcBorders>
+                    <w:left w:val="dashed" w:sz="4" w:space="0" w:color="00B050"/>
+                  </w:tcBorders>
+                  <w:shd w:val="clear" w:color="auto" w:fill="D6E3BC" w:themeFill="accent3" w:themeFillTint="66"/>
                 </w:tcPr>
                 <w:p>
                   <w:pPr>
@@ -1215,6 +1231,7 @@
               <w:tc>
                 <w:tcPr>
                   <w:tcW w:w="356" w:type="dxa"/>
+                  <w:shd w:val="clear" w:color="auto" w:fill="D6E3BC" w:themeFill="accent3" w:themeFillTint="66"/>
                 </w:tcPr>
                 <w:p>
                   <w:pPr>
@@ -1228,6 +1245,7 @@
                   <w:tcBorders>
                     <w:right w:val="single" w:sz="12" w:space="0" w:color="auto"/>
                   </w:tcBorders>
+                  <w:shd w:val="clear" w:color="auto" w:fill="D6E3BC" w:themeFill="accent3" w:themeFillTint="66"/>
                 </w:tcPr>
                 <w:p>
                   <w:pPr>
@@ -1310,7 +1328,19 @@
               <w:spacing w:before="240"/>
             </w:pPr>
             <w:r>
-              <w:t>Ici la division ne se termine jamais car le reste est identique deux fois de suite.</w:t>
+              <w:t>Ici la division ne se termine jamais car le reste est identique deux fois de suite</w:t>
+            </w:r>
+            <w:r>
+              <w:t xml:space="preserve"> dans la </w:t>
+            </w:r>
+            <w:r>
+              <w:rPr>
+                <w:shd w:val="clear" w:color="auto" w:fill="D6E3BC" w:themeFill="accent3" w:themeFillTint="66"/>
+              </w:rPr>
+              <w:t>partie décimale</w:t>
+            </w:r>
+            <w:r>
+              <w:t>.</w:t>
             </w:r>
             <w:r>
               <w:br/>

</xml_diff>